<commit_message>
Laporan Termin Sertifikasi LGU: Syarat 3 memakai changelog resmi PCB GLD V1-V5 (r23)
Co-Authored-By: Claude Opus 5.5 <noreply@anthropic.com>
</commit_message>
<xml_diff>
--- a/Paket LGU/02_Penagihan_Termin_1/01_Laporan_Termin_1_Field_Testing_20Persen.docx
+++ b/Paket LGU/02_Penagihan_Termin_1/01_Laporan_Termin_1_Field_Testing_20Persen.docx
@@ -11,7 +11,7 @@
           <w:noProof/>
         </w:rPr>
         <w:drawing>
-          <wp:inline distT="0" distB="0" distL="0" distR="0" wp14:anchorId="0BE6AB7A" wp14:editId="2B4D13D5">
+          <wp:inline distT="0" distB="0" distL="0" distR="0" wp14:anchorId="79D18C82" wp14:editId="77085567">
             <wp:extent cx="7524000" cy="10620000"/>
             <wp:effectExtent l="0" t="0" r="0" b="0"/>
             <wp:docPr id="1" name="Picture 1"/>
@@ -102,7 +102,7 @@
               </w:rPr>
               <w:lastRenderedPageBreak/>
               <w:drawing>
-                <wp:inline distT="0" distB="0" distL="0" distR="0" wp14:anchorId="46FE98CD" wp14:editId="3038D78A">
+                <wp:inline distT="0" distB="0" distL="0" distR="0" wp14:anchorId="15C14C21" wp14:editId="33923D45">
                   <wp:extent cx="863083" cy="457200"/>
                   <wp:effectExtent l="0" t="0" r="0" b="0"/>
                   <wp:docPr id="2" name="Picture 2"/>
@@ -171,7 +171,7 @@
                 <w:noProof/>
               </w:rPr>
               <w:drawing>
-                <wp:inline distT="0" distB="0" distL="0" distR="0" wp14:anchorId="0FB189E0" wp14:editId="29030774">
+                <wp:inline distT="0" distB="0" distL="0" distR="0" wp14:anchorId="0C454B26" wp14:editId="5960A46E">
                   <wp:extent cx="1112414" cy="329184"/>
                   <wp:effectExtent l="0" t="0" r="0" b="0"/>
                   <wp:docPr id="3" name="Picture 3"/>
@@ -2481,10 +2481,10 @@
           <w:noProof/>
         </w:rPr>
         <w:drawing>
-          <wp:inline distT="0" distB="0" distL="0" distR="0" wp14:anchorId="172DD329" wp14:editId="540A97DF">
+          <wp:inline distT="0" distB="0" distL="0" distR="0" wp14:anchorId="113267DF" wp14:editId="55C78B82">
             <wp:extent cx="5897880" cy="2963947"/>
             <wp:effectExtent l="0" t="0" r="0" b="0"/>
-            <wp:docPr id="1603749560" name="Picture 1603749560"/>
+            <wp:docPr id="855462007" name="Picture 855462007"/>
             <wp:cNvGraphicFramePr>
               <a:graphicFrameLocks xmlns:a="http://schemas.openxmlformats.org/drawingml/2006/main" noChangeAspect="1"/>
             </wp:cNvGraphicFramePr>
@@ -3278,10 +3278,10 @@
           <w:noProof/>
         </w:rPr>
         <w:drawing>
-          <wp:inline distT="0" distB="0" distL="0" distR="0" wp14:anchorId="357126E5" wp14:editId="50EDF3B6">
+          <wp:inline distT="0" distB="0" distL="0" distR="0" wp14:anchorId="633FEE97" wp14:editId="26B0F411">
             <wp:extent cx="5760720" cy="3909766"/>
             <wp:effectExtent l="0" t="0" r="0" b="0"/>
-            <wp:docPr id="1207576264" name="Picture 1207576264"/>
+            <wp:docPr id="142704837" name="Picture 142704837"/>
             <wp:cNvGraphicFramePr>
               <a:graphicFrameLocks xmlns:a="http://schemas.openxmlformats.org/drawingml/2006/main" noChangeAspect="1"/>
             </wp:cNvGraphicFramePr>
@@ -3897,10 +3897,10 @@
           <w:noProof/>
         </w:rPr>
         <w:drawing>
-          <wp:inline distT="0" distB="0" distL="0" distR="0" wp14:anchorId="53AB62C2" wp14:editId="70F89DEA">
+          <wp:inline distT="0" distB="0" distL="0" distR="0" wp14:anchorId="6D900884" wp14:editId="49A38FB6">
             <wp:extent cx="2514600" cy="4163235"/>
             <wp:effectExtent l="0" t="0" r="0" b="0"/>
-            <wp:docPr id="1374016011" name="Picture 1374016011"/>
+            <wp:docPr id="927740238" name="Picture 927740238"/>
             <wp:cNvGraphicFramePr>
               <a:graphicFrameLocks xmlns:a="http://schemas.openxmlformats.org/drawingml/2006/main" noChangeAspect="1"/>
             </wp:cNvGraphicFramePr>
@@ -8274,31 +8274,31 @@
       </w:rPr>
     </w:lvl>
   </w:abstractNum>
-  <w:num w:numId="1" w16cid:durableId="300037079">
+  <w:num w:numId="1" w16cid:durableId="1590502529">
     <w:abstractNumId w:val="8"/>
   </w:num>
-  <w:num w:numId="2" w16cid:durableId="1065883423">
+  <w:num w:numId="2" w16cid:durableId="1921940447">
     <w:abstractNumId w:val="6"/>
   </w:num>
-  <w:num w:numId="3" w16cid:durableId="1422526237">
+  <w:num w:numId="3" w16cid:durableId="877855887">
     <w:abstractNumId w:val="5"/>
   </w:num>
-  <w:num w:numId="4" w16cid:durableId="226186228">
+  <w:num w:numId="4" w16cid:durableId="2015961302">
     <w:abstractNumId w:val="4"/>
   </w:num>
-  <w:num w:numId="5" w16cid:durableId="1991788202">
+  <w:num w:numId="5" w16cid:durableId="326641113">
     <w:abstractNumId w:val="7"/>
   </w:num>
-  <w:num w:numId="6" w16cid:durableId="2087608684">
+  <w:num w:numId="6" w16cid:durableId="1755976901">
     <w:abstractNumId w:val="3"/>
   </w:num>
-  <w:num w:numId="7" w16cid:durableId="1085997536">
+  <w:num w:numId="7" w16cid:durableId="1685207145">
     <w:abstractNumId w:val="2"/>
   </w:num>
-  <w:num w:numId="8" w16cid:durableId="844318909">
+  <w:num w:numId="8" w16cid:durableId="1055392744">
     <w:abstractNumId w:val="1"/>
   </w:num>
-  <w:num w:numId="9" w16cid:durableId="367292583">
+  <w:num w:numId="9" w16cid:durableId="849486112">
     <w:abstractNumId w:val="0"/>
   </w:num>
 </w:numbering>

</xml_diff>